<commit_message>
Add git lfs for pptx file, delete unecassary files, update project report and presentation, Add Documentation
</commit_message>
<xml_diff>
--- a/report/project_tutorial.docx
+++ b/report/project_tutorial.docx
@@ -7,176 +7,282 @@
         <w:pStyle w:val="Title"/>
       </w:pPr>
       <w:r>
-        <w:t>LSTM Hand-Trajectory Prediction for</w:t>
+        <w:rPr>
+          <w:b/>
+          <w:bCs/>
+        </w:rPr>
+        <w:t>Learning to Anticipate</w:t>
+      </w:r>
+      <w:r>
+        <w:rPr>
+          <w:b/>
+          <w:bCs/>
+        </w:rPr>
+        <w:t xml:space="preserve">: </w:t>
+      </w:r>
+      <w:r>
+        <w:t>LSTM Hand-Trajectory Prediction for Latency Compensation in Vision-Based Robot Teleoperation</w:t>
+      </w:r>
+    </w:p>
+    <w:p>
+      <w:pPr>
+        <w:rPr>
+          <w:b/>
+          <w:bCs/>
+        </w:rPr>
+      </w:pPr>
+      <w:r>
+        <w:t>This report explains the problem this project solves, how the solution is implemented, and how to run it step by step.</w:t>
+      </w:r>
+      <w:r>
+        <w:t xml:space="preserve"> I provided the full explanation of my training pipeline code via Jupiter notebook </w:t>
+      </w:r>
+      <w:r>
+        <w:rPr>
+          <w:b/>
+          <w:bCs/>
+        </w:rPr>
+        <w:t>nxp_omniman_ws/report/train_lstm_hand_trajectory.ipynb</w:t>
+      </w:r>
+    </w:p>
+    <w:p>
+      <w:pPr>
+        <w:rPr>
+          <w:b/>
+          <w:bCs/>
+        </w:rPr>
+      </w:pPr>
+    </w:p>
+    <w:p>
+      <w:pPr>
+        <w:pStyle w:val="Heading1"/>
+      </w:pPr>
+      <w:r>
+        <w:t>1. About the Project</w:t>
+      </w:r>
+    </w:p>
+    <w:p>
+      <w:r>
+        <w:rPr>
+          <w:b/>
+        </w:rPr>
+        <w:t xml:space="preserve">The problem. </w:t>
+      </w:r>
+      <w:r>
+        <w:t>The teleoperation pipeline tracks the operator's hand with a webcam (</w:t>
+      </w:r>
+      <w:proofErr w:type="spellStart"/>
+      <w:r>
+        <w:t>MediaPipe</w:t>
+      </w:r>
+      <w:proofErr w:type="spellEnd"/>
+      <w:r>
+        <w:t xml:space="preserve"> Hands) and servos a 6-DOF arm toward it in real time (</w:t>
+      </w:r>
+      <w:proofErr w:type="spellStart"/>
+      <w:r>
+        <w:t>MoveIt</w:t>
+      </w:r>
+      <w:proofErr w:type="spellEnd"/>
+      <w:r>
+        <w:t xml:space="preserve"> Servo pose tracking). The raw hand position estimated from camera images is noisy, so the original pipeline smoothed it with an exponential moving average (EMA). Smoothing removes jitter but introduces lag (~75 </w:t>
+      </w:r>
+      <w:proofErr w:type="spellStart"/>
+      <w:r>
+        <w:t>ms</w:t>
+      </w:r>
+      <w:proofErr w:type="spellEnd"/>
+      <w:r>
+        <w:t>): the robot is always commanded toward where the hand was, not where it is.</w:t>
+      </w:r>
+    </w:p>
+    <w:p>
+      <w:r>
+        <w:rPr>
+          <w:b/>
+        </w:rPr>
+        <w:t xml:space="preserve">The fix. </w:t>
+      </w:r>
+      <w:r>
+        <w:t xml:space="preserve">We replace the EMA with a small LSTM (~4,700 parameters) that predicts the hand's displacement ~100 </w:t>
+      </w:r>
+      <w:proofErr w:type="spellStart"/>
+      <w:r>
+        <w:t>ms</w:t>
+      </w:r>
+      <w:proofErr w:type="spellEnd"/>
+      <w:r>
+        <w:t xml:space="preserve"> ahead from the last 15 frames, compensating the camera–inference–control latency and turning lag into lead. The model is trained on 22,420 self-recorded hand positions — no manual labels are needed, since the future position in the same recording serves as the training target. Predicting displacement (rather than absolute coordinates) makes the model translation-invariant; an earlier absolute-coordinate version failed badly due to distribution shift between workspace regions.</w:t>
+      </w:r>
+    </w:p>
+    <w:p>
+      <w:r>
+        <w:rPr>
+          <w:b/>
+        </w:rPr>
+        <w:t xml:space="preserve">Results. </w:t>
+      </w:r>
+      <w:r>
+        <w:t xml:space="preserve">At a 98 </w:t>
+      </w:r>
+      <w:proofErr w:type="spellStart"/>
+      <w:r>
+        <w:t>ms</w:t>
+      </w:r>
+      <w:proofErr w:type="spellEnd"/>
+      <w:r>
+        <w:t xml:space="preserve"> prediction horizon the LSTM reaches 2.32 mm MAE — 47% better than copying the last frame (persistence) and 68% better than the deployed EMA. The trained model is exported to </w:t>
+      </w:r>
+      <w:proofErr w:type="spellStart"/>
+      <w:r>
+        <w:t>TorchScript</w:t>
+      </w:r>
+      <w:proofErr w:type="spellEnd"/>
+      <w:r>
+        <w:t xml:space="preserve"> and runs inside the live ROS 2 node at 0.1–0.2 </w:t>
+      </w:r>
+      <w:proofErr w:type="spellStart"/>
+      <w:r>
+        <w:t>ms</w:t>
+      </w:r>
+      <w:proofErr w:type="spellEnd"/>
+      <w:r>
+        <w:t xml:space="preserve"> per frame, with a runtime LSTM/EMA toggle and automatic EMA fallback.</w:t>
+      </w:r>
+    </w:p>
+    <w:p/>
+    <w:p>
+      <w:pPr>
+        <w:pStyle w:val="Heading1"/>
+      </w:pPr>
+      <w:r>
+        <w:t>2. System Requirements</w:t>
+      </w:r>
+    </w:p>
+    <w:p>
+      <w:pPr>
+        <w:pStyle w:val="ListBullet"/>
+      </w:pPr>
+      <w:r>
+        <w:t>Ubuntu 22.04 with ROS 2 Humble</w:t>
+      </w:r>
+    </w:p>
+    <w:p>
+      <w:pPr>
+        <w:pStyle w:val="ListBullet"/>
+      </w:pPr>
+      <w:proofErr w:type="spellStart"/>
+      <w:r>
+        <w:lastRenderedPageBreak/>
+        <w:t>MoveIt</w:t>
+      </w:r>
+      <w:proofErr w:type="spellEnd"/>
+      <w:r>
+        <w:t xml:space="preserve"> 2</w:t>
+      </w:r>
+    </w:p>
+    <w:p>
+      <w:pPr>
+        <w:pStyle w:val="ListBullet"/>
+      </w:pPr>
+      <w:r>
+        <w:t>Python dependencies — listed in nxp_omniman_ws/project/requirement.txt; install them with:</w:t>
       </w:r>
       <w:r>
         <w:t xml:space="preserve"> </w:t>
       </w:r>
       <w:r>
-        <w:t>Latency Compensation in Vision-Based Robot Teleoperation</w:t>
-      </w:r>
-    </w:p>
-    <w:p>
-      <w:r>
-        <w:t>This report explains the problem this project solves, how the solution is implemented, and how to run it step by step.</w:t>
-      </w:r>
+        <w:rPr>
+          <w:rFonts w:ascii="Consolas" w:hAnsi="Consolas"/>
+          <w:sz w:val="20"/>
+        </w:rPr>
+        <w:t>pip install -r requirement.txt</w:t>
+      </w:r>
+    </w:p>
+    <w:p>
+      <w:pPr>
+        <w:pStyle w:val="ListBullet"/>
+        <w:numPr>
+          <w:ilvl w:val="0"/>
+          <w:numId w:val="0"/>
+        </w:numPr>
+      </w:pPr>
     </w:p>
     <w:p>
       <w:pPr>
         <w:pStyle w:val="Heading1"/>
       </w:pPr>
       <w:r>
-        <w:t>1. About the Project</w:t>
-      </w:r>
-    </w:p>
-    <w:p>
-      <w:r>
-        <w:rPr>
-          <w:b/>
-        </w:rPr>
-        <w:t xml:space="preserve">The problem. </w:t>
-      </w:r>
-      <w:r>
-        <w:t>The teleoperation pipeline tracks the operator's hand with a webcam (</w:t>
-      </w:r>
-      <w:proofErr w:type="spellStart"/>
-      <w:r>
-        <w:t>MediaPipe</w:t>
-      </w:r>
-      <w:proofErr w:type="spellEnd"/>
-      <w:r>
-        <w:t xml:space="preserve"> Hands) and servos a 6-DOF arm toward it in real time (</w:t>
-      </w:r>
-      <w:proofErr w:type="spellStart"/>
-      <w:r>
-        <w:t>MoveIt</w:t>
-      </w:r>
-      <w:proofErr w:type="spellEnd"/>
-      <w:r>
-        <w:t xml:space="preserve"> Servo pose tracking). The raw hand position estimated from camera images is noisy, so the original pipeline smoothed it with an exponential moving average (EMA). Smoothing removes jitter but introduces lag (~75 </w:t>
-      </w:r>
-      <w:proofErr w:type="spellStart"/>
-      <w:r>
-        <w:t>ms</w:t>
-      </w:r>
-      <w:proofErr w:type="spellEnd"/>
-      <w:r>
-        <w:t>): the robot is always commanded toward where the hand was, not where it is.</w:t>
-      </w:r>
-    </w:p>
-    <w:p>
-      <w:r>
-        <w:rPr>
-          <w:b/>
-        </w:rPr>
-        <w:t xml:space="preserve">The fix. </w:t>
-      </w:r>
-      <w:r>
-        <w:t xml:space="preserve">We replace the EMA with a small LSTM (~4,700 parameters) that predicts the hand's displacement ~100 </w:t>
-      </w:r>
-      <w:proofErr w:type="spellStart"/>
-      <w:r>
-        <w:t>ms</w:t>
-      </w:r>
-      <w:proofErr w:type="spellEnd"/>
-      <w:r>
-        <w:t xml:space="preserve"> ahead from the last 15 frames, compensating the camera–inference–control latency and turning lag into lead. The model is trained on 22,420 self-recorded hand positions — no manual labels are needed, since the future position in the same recording serves as the training target. Predicting displacement (rather than absolute coordinates) makes the model translation-invariant; an earlier absolute-coordinate version failed badly due to distribution shift between workspace regions.</w:t>
-      </w:r>
-    </w:p>
-    <w:p>
-      <w:r>
-        <w:rPr>
-          <w:b/>
-        </w:rPr>
-        <w:t xml:space="preserve">Results. </w:t>
-      </w:r>
-      <w:r>
-        <w:t xml:space="preserve">At a 98 </w:t>
-      </w:r>
-      <w:proofErr w:type="spellStart"/>
-      <w:r>
-        <w:t>ms</w:t>
-      </w:r>
-      <w:proofErr w:type="spellEnd"/>
-      <w:r>
-        <w:t xml:space="preserve"> prediction horizon the LSTM reaches 2.32 mm MAE — 47% better than copying the last frame (persistence) and 68% better than the deployed EMA. The trained model is exported to </w:t>
-      </w:r>
-      <w:proofErr w:type="spellStart"/>
-      <w:r>
-        <w:t>TorchScript</w:t>
-      </w:r>
-      <w:proofErr w:type="spellEnd"/>
-      <w:r>
-        <w:t xml:space="preserve"> and runs inside the live ROS 2 node at 0.1–0.2 </w:t>
-      </w:r>
-      <w:proofErr w:type="spellStart"/>
-      <w:r>
-        <w:t>ms</w:t>
-      </w:r>
-      <w:proofErr w:type="spellEnd"/>
-      <w:r>
-        <w:t xml:space="preserve"> per frame, with a runtime LSTM/EMA toggle and automatic EMA fallback.</w:t>
-      </w:r>
-    </w:p>
-    <w:p>
-      <w:pPr>
-        <w:pStyle w:val="Heading1"/>
-      </w:pPr>
-      <w:r>
-        <w:t>2. System Requirements</w:t>
-      </w:r>
-    </w:p>
-    <w:p>
-      <w:pPr>
-        <w:pStyle w:val="ListBullet"/>
-      </w:pPr>
-      <w:r>
-        <w:t>Ubuntu 22.04 with ROS 2 Humble</w:t>
-      </w:r>
-    </w:p>
-    <w:p>
-      <w:pPr>
-        <w:pStyle w:val="ListBullet"/>
-      </w:pPr>
-      <w:proofErr w:type="spellStart"/>
-      <w:r>
-        <w:t>MoveIt</w:t>
-      </w:r>
-      <w:proofErr w:type="spellEnd"/>
-      <w:r>
-        <w:t xml:space="preserve"> 2</w:t>
-      </w:r>
-    </w:p>
-    <w:p>
-      <w:pPr>
-        <w:pStyle w:val="ListBullet"/>
-      </w:pPr>
-      <w:r>
-        <w:t xml:space="preserve">Python dependencies — listed in </w:t>
-      </w:r>
-      <w:proofErr w:type="spellStart"/>
-      <w:r>
-        <w:t>nxp_omniman_ws</w:t>
-      </w:r>
-      <w:proofErr w:type="spellEnd"/>
-      <w:r>
-        <w:t>/project/requirement.txt; install them with:</w:t>
-      </w:r>
-    </w:p>
-    <w:p>
-      <w:pPr>
-        <w:rPr>
-          <w:rFonts w:ascii="Consolas" w:hAnsi="Consolas"/>
-          <w:sz w:val="20"/>
-        </w:rPr>
-      </w:pPr>
-      <w:r>
-        <w:rPr>
-          <w:rFonts w:ascii="Consolas" w:hAnsi="Consolas"/>
-          <w:sz w:val="20"/>
-        </w:rPr>
-        <w:t>pip install -r requirement.txt</w:t>
-      </w:r>
+        <w:t>3. Build and Run — Step by Step</w:t>
+      </w:r>
+    </w:p>
+    <w:p>
+      <w:pPr>
+        <w:pStyle w:val="Heading2"/>
+        <w:rPr>
+          <w:rFonts w:asciiTheme="minorHAnsi" w:hAnsiTheme="minorHAnsi"/>
+        </w:rPr>
+      </w:pPr>
+      <w:r>
+        <w:t>Step 1 — Create the workspace</w:t>
+      </w:r>
+    </w:p>
+    <w:p>
+      <w:pPr>
+        <w:rPr>
+          <w:rFonts w:ascii="Consolas" w:hAnsi="Consolas"/>
+          <w:sz w:val="20"/>
+        </w:rPr>
+      </w:pPr>
+      <w:proofErr w:type="spellStart"/>
+      <w:r>
+        <w:rPr>
+          <w:rFonts w:ascii="Consolas" w:hAnsi="Consolas"/>
+          <w:sz w:val="20"/>
+        </w:rPr>
+        <w:t>mkdir</w:t>
+      </w:r>
+      <w:proofErr w:type="spellEnd"/>
+      <w:r>
+        <w:rPr>
+          <w:rFonts w:ascii="Consolas" w:hAnsi="Consolas"/>
+          <w:sz w:val="20"/>
+        </w:rPr>
+        <w:t xml:space="preserve"> -p ~/workspaces/nxp_omniman_ws/</w:t>
+      </w:r>
+      <w:proofErr w:type="spellStart"/>
+      <w:r>
+        <w:rPr>
+          <w:rFonts w:ascii="Consolas" w:hAnsi="Consolas"/>
+          <w:sz w:val="20"/>
+        </w:rPr>
+        <w:t>src</w:t>
+      </w:r>
+      <w:proofErr w:type="spellEnd"/>
+    </w:p>
+    <w:p>
+      <w:pPr>
+        <w:rPr>
+          <w:rFonts w:ascii="Consolas" w:hAnsi="Consolas"/>
+          <w:sz w:val="20"/>
+        </w:rPr>
+      </w:pPr>
+      <w:r>
+        <w:rPr>
+          <w:rFonts w:ascii="Consolas" w:hAnsi="Consolas"/>
+          <w:sz w:val="20"/>
+        </w:rPr>
+        <w:t>cd ~/workspaces/nxp_omniman_ws/</w:t>
+      </w:r>
+      <w:proofErr w:type="spellStart"/>
+      <w:r>
+        <w:rPr>
+          <w:rFonts w:ascii="Consolas" w:hAnsi="Consolas"/>
+          <w:sz w:val="20"/>
+        </w:rPr>
+        <w:t>src</w:t>
+      </w:r>
+      <w:proofErr w:type="spellEnd"/>
     </w:p>
     <w:p>
       <w:pPr>
@@ -190,54 +296,34 @@
     </w:p>
     <w:p>
       <w:pPr>
-        <w:pStyle w:val="Heading1"/>
-      </w:pPr>
-      <w:r>
-        <w:lastRenderedPageBreak/>
-        <w:t>3. Build and Run — Step by Step</w:t>
-      </w:r>
-    </w:p>
-    <w:p>
-      <w:pPr>
         <w:pStyle w:val="Heading2"/>
-        <w:rPr>
-          <w:rFonts w:asciiTheme="minorHAnsi" w:hAnsiTheme="minorHAnsi"/>
-        </w:rPr>
-      </w:pPr>
-      <w:r>
-        <w:t>Step 1 — Create the workspace</w:t>
-      </w:r>
-    </w:p>
-    <w:p>
-      <w:pPr>
-        <w:rPr>
-          <w:rFonts w:ascii="Consolas" w:hAnsi="Consolas"/>
-          <w:sz w:val="20"/>
-        </w:rPr>
-      </w:pPr>
-      <w:proofErr w:type="spellStart"/>
-      <w:r>
-        <w:rPr>
-          <w:rFonts w:ascii="Consolas" w:hAnsi="Consolas"/>
-          <w:sz w:val="20"/>
-        </w:rPr>
-        <w:t>mkdir</w:t>
-      </w:r>
-      <w:proofErr w:type="spellEnd"/>
-      <w:r>
-        <w:rPr>
-          <w:rFonts w:ascii="Consolas" w:hAnsi="Consolas"/>
-          <w:sz w:val="20"/>
-        </w:rPr>
-        <w:t xml:space="preserve"> -p ~/workspaces/</w:t>
-      </w:r>
-      <w:proofErr w:type="spellStart"/>
-      <w:r>
-        <w:rPr>
-          <w:rFonts w:ascii="Consolas" w:hAnsi="Consolas"/>
-          <w:sz w:val="20"/>
-        </w:rPr>
-        <w:t>nxp_omniman_ws</w:t>
+      </w:pPr>
+      <w:r>
+        <w:t>Step 2 — Clone the repository (skip if you downloaded the ZIP)</w:t>
+      </w:r>
+    </w:p>
+    <w:p>
+      <w:pPr>
+        <w:rPr>
+          <w:rFonts w:ascii="Consolas" w:hAnsi="Consolas"/>
+          <w:sz w:val="20"/>
+        </w:rPr>
+      </w:pPr>
+      <w:r>
+        <w:rPr>
+          <w:rFonts w:ascii="Consolas" w:hAnsi="Consolas"/>
+          <w:sz w:val="20"/>
+        </w:rPr>
+        <w:t xml:space="preserve">git clone </w:t>
+      </w:r>
+      <w:proofErr w:type="spellStart"/>
+      <w:proofErr w:type="gramStart"/>
+      <w:r>
+        <w:rPr>
+          <w:rFonts w:ascii="Consolas" w:hAnsi="Consolas"/>
+          <w:sz w:val="20"/>
+        </w:rPr>
+        <w:t>git@github.com:dokterkepin</w:t>
       </w:r>
       <w:proofErr w:type="spellEnd"/>
       <w:r>
@@ -253,49 +339,17 @@
           <w:rFonts w:ascii="Consolas" w:hAnsi="Consolas"/>
           <w:sz w:val="20"/>
         </w:rPr>
-        <w:t>src</w:t>
-      </w:r>
-      <w:proofErr w:type="spellEnd"/>
-    </w:p>
-    <w:p>
-      <w:pPr>
-        <w:rPr>
-          <w:rFonts w:ascii="Consolas" w:hAnsi="Consolas"/>
-          <w:sz w:val="20"/>
-        </w:rPr>
-      </w:pPr>
-      <w:r>
-        <w:rPr>
-          <w:rFonts w:ascii="Consolas" w:hAnsi="Consolas"/>
-          <w:sz w:val="20"/>
-        </w:rPr>
-        <w:t>cd ~/workspaces/</w:t>
-      </w:r>
-      <w:proofErr w:type="spellStart"/>
-      <w:r>
-        <w:rPr>
-          <w:rFonts w:ascii="Consolas" w:hAnsi="Consolas"/>
-          <w:sz w:val="20"/>
-        </w:rPr>
-        <w:t>nxp_omniman_ws</w:t>
-      </w:r>
-      <w:proofErr w:type="spellEnd"/>
-      <w:r>
-        <w:rPr>
-          <w:rFonts w:ascii="Consolas" w:hAnsi="Consolas"/>
-          <w:sz w:val="20"/>
-        </w:rPr>
-        <w:t>/</w:t>
-      </w:r>
-      <w:proofErr w:type="spellStart"/>
-      <w:r>
-        <w:rPr>
-          <w:rFonts w:ascii="Consolas" w:hAnsi="Consolas"/>
-          <w:sz w:val="20"/>
-        </w:rPr>
-        <w:t>src</w:t>
-      </w:r>
-      <w:proofErr w:type="spellEnd"/>
+        <w:t>nxp_omniman_ws.git</w:t>
+      </w:r>
+      <w:proofErr w:type="spellEnd"/>
+      <w:proofErr w:type="gramEnd"/>
+      <w:r>
+        <w:rPr>
+          <w:rFonts w:ascii="Consolas" w:hAnsi="Consolas"/>
+          <w:sz w:val="20"/>
+        </w:rPr>
+        <w:t xml:space="preserve"> .</w:t>
+      </w:r>
     </w:p>
     <w:p>
       <w:pPr>
@@ -312,56 +366,83 @@
         <w:pStyle w:val="Heading2"/>
       </w:pPr>
       <w:r>
-        <w:t>Step 2 — Clone the repository (skip if you downloaded the ZIP)</w:t>
-      </w:r>
-    </w:p>
-    <w:p>
-      <w:pPr>
-        <w:rPr>
-          <w:rFonts w:ascii="Consolas" w:hAnsi="Consolas"/>
-          <w:sz w:val="20"/>
-        </w:rPr>
-      </w:pPr>
-      <w:r>
-        <w:rPr>
-          <w:rFonts w:ascii="Consolas" w:hAnsi="Consolas"/>
-          <w:sz w:val="20"/>
-        </w:rPr>
-        <w:t xml:space="preserve">git clone </w:t>
-      </w:r>
-      <w:proofErr w:type="spellStart"/>
-      <w:proofErr w:type="gramStart"/>
-      <w:r>
-        <w:rPr>
-          <w:rFonts w:ascii="Consolas" w:hAnsi="Consolas"/>
-          <w:sz w:val="20"/>
-        </w:rPr>
-        <w:t>git@github.com:dokterkepin</w:t>
-      </w:r>
-      <w:proofErr w:type="spellEnd"/>
-      <w:r>
-        <w:rPr>
-          <w:rFonts w:ascii="Consolas" w:hAnsi="Consolas"/>
-          <w:sz w:val="20"/>
-        </w:rPr>
-        <w:t>/</w:t>
-      </w:r>
-      <w:proofErr w:type="spellStart"/>
-      <w:r>
-        <w:rPr>
-          <w:rFonts w:ascii="Consolas" w:hAnsi="Consolas"/>
-          <w:sz w:val="20"/>
-        </w:rPr>
-        <w:t>nxp_omniman_ws.git</w:t>
-      </w:r>
-      <w:proofErr w:type="spellEnd"/>
-      <w:proofErr w:type="gramEnd"/>
-      <w:r>
-        <w:rPr>
-          <w:rFonts w:ascii="Consolas" w:hAnsi="Consolas"/>
-          <w:sz w:val="20"/>
-        </w:rPr>
-        <w:t xml:space="preserve"> .</w:t>
+        <w:t xml:space="preserve">Step 3 — Install ROS dependencies via </w:t>
+      </w:r>
+      <w:proofErr w:type="spellStart"/>
+      <w:r>
+        <w:t>rosdep</w:t>
+      </w:r>
+      <w:proofErr w:type="spellEnd"/>
+    </w:p>
+    <w:p>
+      <w:pPr>
+        <w:rPr>
+          <w:rFonts w:ascii="Consolas" w:hAnsi="Consolas"/>
+          <w:sz w:val="20"/>
+        </w:rPr>
+      </w:pPr>
+      <w:r>
+        <w:rPr>
+          <w:rFonts w:ascii="Consolas" w:hAnsi="Consolas"/>
+          <w:sz w:val="20"/>
+        </w:rPr>
+        <w:t>cd ~/workspaces/nxp_omniman_ws</w:t>
+      </w:r>
+    </w:p>
+    <w:p>
+      <w:pPr>
+        <w:rPr>
+          <w:rFonts w:ascii="Consolas" w:hAnsi="Consolas"/>
+          <w:sz w:val="20"/>
+        </w:rPr>
+      </w:pPr>
+      <w:proofErr w:type="spellStart"/>
+      <w:r>
+        <w:rPr>
+          <w:rFonts w:ascii="Consolas" w:hAnsi="Consolas"/>
+          <w:sz w:val="20"/>
+        </w:rPr>
+        <w:t>rosdep</w:t>
+      </w:r>
+      <w:proofErr w:type="spellEnd"/>
+      <w:r>
+        <w:rPr>
+          <w:rFonts w:ascii="Consolas" w:hAnsi="Consolas"/>
+          <w:sz w:val="20"/>
+        </w:rPr>
+        <w:t xml:space="preserve"> install --from-paths </w:t>
+      </w:r>
+      <w:proofErr w:type="spellStart"/>
+      <w:r>
+        <w:rPr>
+          <w:rFonts w:ascii="Consolas" w:hAnsi="Consolas"/>
+          <w:sz w:val="20"/>
+        </w:rPr>
+        <w:t>src</w:t>
+      </w:r>
+      <w:proofErr w:type="spellEnd"/>
+      <w:r>
+        <w:rPr>
+          <w:rFonts w:ascii="Consolas" w:hAnsi="Consolas"/>
+          <w:sz w:val="20"/>
+        </w:rPr>
+        <w:t xml:space="preserve"> --ignore-</w:t>
+      </w:r>
+      <w:proofErr w:type="spellStart"/>
+      <w:r>
+        <w:rPr>
+          <w:rFonts w:ascii="Consolas" w:hAnsi="Consolas"/>
+          <w:sz w:val="20"/>
+        </w:rPr>
+        <w:t>src</w:t>
+      </w:r>
+      <w:proofErr w:type="spellEnd"/>
+      <w:r>
+        <w:rPr>
+          <w:rFonts w:ascii="Consolas" w:hAnsi="Consolas"/>
+          <w:sz w:val="20"/>
+        </w:rPr>
+        <w:t xml:space="preserve"> -r -y</w:t>
       </w:r>
     </w:p>
     <w:p>
@@ -379,101 +460,54 @@
         <w:pStyle w:val="Heading2"/>
       </w:pPr>
       <w:r>
-        <w:t xml:space="preserve">Step 3 — Install ROS dependencies via </w:t>
-      </w:r>
-      <w:proofErr w:type="spellStart"/>
-      <w:r>
-        <w:t>rosdep</w:t>
-      </w:r>
-      <w:proofErr w:type="spellEnd"/>
-    </w:p>
-    <w:p>
-      <w:pPr>
-        <w:rPr>
-          <w:rFonts w:ascii="Consolas" w:hAnsi="Consolas"/>
-          <w:sz w:val="20"/>
-        </w:rPr>
-      </w:pPr>
-      <w:r>
-        <w:rPr>
-          <w:rFonts w:ascii="Consolas" w:hAnsi="Consolas"/>
-          <w:sz w:val="20"/>
-        </w:rPr>
-        <w:t>cd ~/workspaces/</w:t>
-      </w:r>
-      <w:proofErr w:type="spellStart"/>
-      <w:r>
-        <w:rPr>
-          <w:rFonts w:ascii="Consolas" w:hAnsi="Consolas"/>
-          <w:sz w:val="20"/>
-        </w:rPr>
-        <w:t>nxp_omniman_ws</w:t>
-      </w:r>
-      <w:proofErr w:type="spellEnd"/>
-    </w:p>
-    <w:p>
-      <w:pPr>
-        <w:rPr>
-          <w:rFonts w:ascii="Consolas" w:hAnsi="Consolas"/>
-          <w:sz w:val="20"/>
-        </w:rPr>
-      </w:pPr>
-      <w:proofErr w:type="spellStart"/>
-      <w:r>
-        <w:rPr>
-          <w:rFonts w:ascii="Consolas" w:hAnsi="Consolas"/>
-          <w:sz w:val="20"/>
-        </w:rPr>
-        <w:t>rosdep</w:t>
-      </w:r>
-      <w:proofErr w:type="spellEnd"/>
-      <w:r>
-        <w:rPr>
-          <w:rFonts w:ascii="Consolas" w:hAnsi="Consolas"/>
-          <w:sz w:val="20"/>
-        </w:rPr>
-        <w:t xml:space="preserve"> install --from-paths </w:t>
-      </w:r>
-      <w:proofErr w:type="spellStart"/>
-      <w:r>
-        <w:rPr>
-          <w:rFonts w:ascii="Consolas" w:hAnsi="Consolas"/>
-          <w:sz w:val="20"/>
-        </w:rPr>
-        <w:t>src</w:t>
-      </w:r>
-      <w:proofErr w:type="spellEnd"/>
-      <w:r>
-        <w:rPr>
-          <w:rFonts w:ascii="Consolas" w:hAnsi="Consolas"/>
-          <w:sz w:val="20"/>
-        </w:rPr>
-        <w:t xml:space="preserve"> --ignore-</w:t>
-      </w:r>
-      <w:proofErr w:type="spellStart"/>
-      <w:r>
-        <w:rPr>
-          <w:rFonts w:ascii="Consolas" w:hAnsi="Consolas"/>
-          <w:sz w:val="20"/>
-        </w:rPr>
-        <w:t>src</w:t>
-      </w:r>
-      <w:proofErr w:type="spellEnd"/>
-      <w:r>
-        <w:rPr>
-          <w:rFonts w:ascii="Consolas" w:hAnsi="Consolas"/>
-          <w:sz w:val="20"/>
-        </w:rPr>
-        <w:t xml:space="preserve"> -r -y</w:t>
-      </w:r>
-    </w:p>
-    <w:p>
-      <w:pPr>
-        <w:rPr>
-          <w:rFonts w:cstheme="minorHAnsi"/>
-          <w:color w:val="000000" w:themeColor="text1"/>
-          <w:sz w:val="22"/>
-          <w:szCs w:val="22"/>
+        <w:t>Step 4 — Build the workspace</w:t>
+      </w:r>
+    </w:p>
+    <w:p>
+      <w:pPr>
+        <w:rPr>
+          <w:rFonts w:ascii="Consolas" w:hAnsi="Consolas"/>
+          <w:sz w:val="20"/>
+        </w:rPr>
+      </w:pPr>
+      <w:proofErr w:type="spellStart"/>
+      <w:r>
+        <w:rPr>
+          <w:rFonts w:ascii="Consolas" w:hAnsi="Consolas"/>
+          <w:sz w:val="20"/>
+        </w:rPr>
+        <w:t>colcon</w:t>
+      </w:r>
+      <w:proofErr w:type="spellEnd"/>
+      <w:r>
+        <w:rPr>
+          <w:rFonts w:ascii="Consolas" w:hAnsi="Consolas"/>
+          <w:sz w:val="20"/>
+        </w:rPr>
+        <w:t xml:space="preserve"> build --</w:t>
+      </w:r>
+      <w:proofErr w:type="spellStart"/>
+      <w:r>
+        <w:rPr>
+          <w:rFonts w:ascii="Consolas" w:hAnsi="Consolas"/>
+          <w:sz w:val="20"/>
+        </w:rPr>
+        <w:t>symlink</w:t>
+      </w:r>
+      <w:proofErr w:type="spellEnd"/>
+      <w:r>
+        <w:rPr>
+          <w:rFonts w:ascii="Consolas" w:hAnsi="Consolas"/>
+          <w:sz w:val="20"/>
+        </w:rPr>
+        <w:t>-install</w:t>
+      </w:r>
+    </w:p>
+    <w:p>
+      <w:pPr>
+        <w:rPr>
+          <w:rFonts w:ascii="Consolas" w:hAnsi="Consolas"/>
+          <w:sz w:val="20"/>
         </w:rPr>
       </w:pPr>
     </w:p>
@@ -482,221 +516,214 @@
         <w:pStyle w:val="Heading2"/>
       </w:pPr>
       <w:r>
-        <w:t>Step 4 — Build the workspace</w:t>
-      </w:r>
-    </w:p>
-    <w:p>
-      <w:pPr>
-        <w:rPr>
-          <w:rFonts w:ascii="Consolas" w:hAnsi="Consolas"/>
-          <w:sz w:val="20"/>
-        </w:rPr>
-      </w:pPr>
-      <w:proofErr w:type="spellStart"/>
-      <w:r>
-        <w:rPr>
-          <w:rFonts w:ascii="Consolas" w:hAnsi="Consolas"/>
-          <w:sz w:val="20"/>
-        </w:rPr>
-        <w:t>colcon</w:t>
-      </w:r>
-      <w:proofErr w:type="spellEnd"/>
-      <w:r>
-        <w:rPr>
-          <w:rFonts w:ascii="Consolas" w:hAnsi="Consolas"/>
-          <w:sz w:val="20"/>
-        </w:rPr>
-        <w:t xml:space="preserve"> build --</w:t>
-      </w:r>
-      <w:proofErr w:type="spellStart"/>
-      <w:r>
-        <w:rPr>
-          <w:rFonts w:ascii="Consolas" w:hAnsi="Consolas"/>
-          <w:sz w:val="20"/>
-        </w:rPr>
-        <w:t>symlink</w:t>
-      </w:r>
-      <w:proofErr w:type="spellEnd"/>
-      <w:r>
-        <w:rPr>
-          <w:rFonts w:ascii="Consolas" w:hAnsi="Consolas"/>
-          <w:sz w:val="20"/>
-        </w:rPr>
-        <w:t>-install</w:t>
-      </w:r>
-    </w:p>
+        <w:t>Step 5 — Set the camera port</w:t>
+      </w:r>
+    </w:p>
+    <w:p>
+      <w:r>
+        <w:t xml:space="preserve">You can check which port the camera is attached to in Ubuntu with: </w:t>
+      </w:r>
+      <w:r>
+        <w:rPr>
+          <w:rFonts w:ascii="Consolas" w:hAnsi="Consolas"/>
+          <w:sz w:val="20"/>
+        </w:rPr>
+        <w:t>v4l2-ctl --list-devices</w:t>
+      </w:r>
+    </w:p>
+    <w:p>
+      <w:r>
+        <w:t xml:space="preserve">Set the camera port in </w:t>
+      </w:r>
+      <w:r>
+        <w:rPr>
+          <w:rFonts w:ascii="Consolas" w:hAnsi="Consolas"/>
+          <w:sz w:val="20"/>
+        </w:rPr>
+        <w:t>src/project/mediapipe_pose_tracking/launch/omniman_hand_teleop_demo_launch.py</w:t>
+      </w:r>
+      <w:r>
+        <w:t>:</w:t>
+      </w:r>
+    </w:p>
+    <w:p>
+      <w:proofErr w:type="spellStart"/>
+      <w:proofErr w:type="gramStart"/>
+      <w:r>
+        <w:rPr>
+          <w:rFonts w:ascii="Consolas" w:hAnsi="Consolas"/>
+          <w:sz w:val="20"/>
+        </w:rPr>
+        <w:t>DeclareLaunchArgument</w:t>
+      </w:r>
+      <w:proofErr w:type="spellEnd"/>
+      <w:r>
+        <w:rPr>
+          <w:rFonts w:ascii="Consolas" w:hAnsi="Consolas"/>
+          <w:sz w:val="20"/>
+        </w:rPr>
+        <w:t>(</w:t>
+      </w:r>
+      <w:proofErr w:type="gramEnd"/>
+      <w:r>
+        <w:rPr>
+          <w:rFonts w:ascii="Consolas" w:hAnsi="Consolas"/>
+          <w:sz w:val="20"/>
+        </w:rPr>
+        <w:t>"</w:t>
+      </w:r>
+      <w:proofErr w:type="spellStart"/>
+      <w:r>
+        <w:rPr>
+          <w:rFonts w:ascii="Consolas" w:hAnsi="Consolas"/>
+          <w:sz w:val="20"/>
+        </w:rPr>
+        <w:t>camera_device</w:t>
+      </w:r>
+      <w:proofErr w:type="spellEnd"/>
+      <w:r>
+        <w:rPr>
+          <w:rFonts w:ascii="Consolas" w:hAnsi="Consolas"/>
+          <w:sz w:val="20"/>
+        </w:rPr>
+        <w:t xml:space="preserve">", </w:t>
+      </w:r>
+      <w:proofErr w:type="spellStart"/>
+      <w:r>
+        <w:rPr>
+          <w:rFonts w:ascii="Consolas" w:hAnsi="Consolas"/>
+          <w:sz w:val="20"/>
+        </w:rPr>
+        <w:t>default_value</w:t>
+      </w:r>
+      <w:proofErr w:type="spellEnd"/>
+      <w:r>
+        <w:rPr>
+          <w:rFonts w:ascii="Consolas" w:hAnsi="Consolas"/>
+          <w:sz w:val="20"/>
+        </w:rPr>
+        <w:t>="0")</w:t>
+      </w:r>
+      <w:r>
+        <w:t xml:space="preserve"> — at line 167 the default is camera port 0; change it to the port your camera is attached to.</w:t>
+      </w:r>
+    </w:p>
+    <w:p>
+      <w:r>
+        <w:t xml:space="preserve">Also make sure the port is updated in </w:t>
+      </w:r>
+      <w:r>
+        <w:rPr>
+          <w:rFonts w:ascii="Consolas" w:hAnsi="Consolas"/>
+          <w:sz w:val="20"/>
+        </w:rPr>
+        <w:t>src/project/mediapipe_pose_tracking/scripts/hand_pose_publisher_node.py</w:t>
+      </w:r>
+      <w:r>
+        <w:t>:</w:t>
+      </w:r>
+    </w:p>
+    <w:p>
+      <w:proofErr w:type="spellStart"/>
+      <w:proofErr w:type="gramStart"/>
+      <w:r>
+        <w:rPr>
+          <w:rFonts w:ascii="Consolas" w:hAnsi="Consolas"/>
+          <w:sz w:val="20"/>
+        </w:rPr>
+        <w:lastRenderedPageBreak/>
+        <w:t>DeclareLaunchArgument</w:t>
+      </w:r>
+      <w:proofErr w:type="spellEnd"/>
+      <w:r>
+        <w:rPr>
+          <w:rFonts w:ascii="Consolas" w:hAnsi="Consolas"/>
+          <w:sz w:val="20"/>
+        </w:rPr>
+        <w:t>(</w:t>
+      </w:r>
+      <w:proofErr w:type="gramEnd"/>
+      <w:r>
+        <w:rPr>
+          <w:rFonts w:ascii="Consolas" w:hAnsi="Consolas"/>
+          <w:sz w:val="20"/>
+        </w:rPr>
+        <w:t>"</w:t>
+      </w:r>
+      <w:proofErr w:type="spellStart"/>
+      <w:r>
+        <w:rPr>
+          <w:rFonts w:ascii="Consolas" w:hAnsi="Consolas"/>
+          <w:sz w:val="20"/>
+        </w:rPr>
+        <w:t>camera_device</w:t>
+      </w:r>
+      <w:proofErr w:type="spellEnd"/>
+      <w:r>
+        <w:rPr>
+          <w:rFonts w:ascii="Consolas" w:hAnsi="Consolas"/>
+          <w:sz w:val="20"/>
+        </w:rPr>
+        <w:t xml:space="preserve">", </w:t>
+      </w:r>
+      <w:proofErr w:type="spellStart"/>
+      <w:r>
+        <w:rPr>
+          <w:rFonts w:ascii="Consolas" w:hAnsi="Consolas"/>
+          <w:sz w:val="20"/>
+        </w:rPr>
+        <w:t>default_value</w:t>
+      </w:r>
+      <w:proofErr w:type="spellEnd"/>
+      <w:r>
+        <w:rPr>
+          <w:rFonts w:ascii="Consolas" w:hAnsi="Consolas"/>
+          <w:sz w:val="20"/>
+        </w:rPr>
+        <w:t>="0")</w:t>
+      </w:r>
+      <w:r>
+        <w:t xml:space="preserve"> — see line 67; the default is port 0.</w:t>
+      </w:r>
+    </w:p>
+    <w:p/>
     <w:p>
       <w:pPr>
         <w:pStyle w:val="Heading2"/>
       </w:pPr>
       <w:r>
-        <w:t>Step 5 — Set the camera port</w:t>
-      </w:r>
-    </w:p>
-    <w:p>
-      <w:r>
-        <w:t xml:space="preserve">You can check which port the camera is attached to in Ubuntu with: </w:t>
-      </w:r>
-      <w:r>
-        <w:rPr>
-          <w:rFonts w:ascii="Consolas" w:hAnsi="Consolas"/>
-          <w:sz w:val="20"/>
-        </w:rPr>
-        <w:t>v4l2-ctl --list-devices</w:t>
-      </w:r>
-    </w:p>
-    <w:p>
-      <w:r>
-        <w:t xml:space="preserve">Set the camera port in </w:t>
-      </w:r>
-      <w:r>
-        <w:rPr>
-          <w:rFonts w:ascii="Consolas" w:hAnsi="Consolas"/>
-          <w:sz w:val="20"/>
-        </w:rPr>
-        <w:t>src/project/mediapipe_pose_tracking/launch/omniman_hand_teleop_demo_launch.py</w:t>
-      </w:r>
-      <w:r>
-        <w:t>:</w:t>
-      </w:r>
-    </w:p>
-    <w:p>
-      <w:proofErr w:type="spellStart"/>
-      <w:proofErr w:type="gramStart"/>
-      <w:r>
-        <w:rPr>
-          <w:rFonts w:ascii="Consolas" w:hAnsi="Consolas"/>
-          <w:sz w:val="20"/>
-        </w:rPr>
-        <w:t>DeclareLaunchArgument</w:t>
-      </w:r>
-      <w:proofErr w:type="spellEnd"/>
-      <w:r>
-        <w:rPr>
-          <w:rFonts w:ascii="Consolas" w:hAnsi="Consolas"/>
-          <w:sz w:val="20"/>
-        </w:rPr>
-        <w:t>(</w:t>
-      </w:r>
-      <w:proofErr w:type="gramEnd"/>
-      <w:r>
-        <w:rPr>
-          <w:rFonts w:ascii="Consolas" w:hAnsi="Consolas"/>
-          <w:sz w:val="20"/>
-        </w:rPr>
-        <w:t>"</w:t>
-      </w:r>
-      <w:proofErr w:type="spellStart"/>
-      <w:r>
-        <w:rPr>
-          <w:rFonts w:ascii="Consolas" w:hAnsi="Consolas"/>
-          <w:sz w:val="20"/>
-        </w:rPr>
-        <w:t>camera_device</w:t>
-      </w:r>
-      <w:proofErr w:type="spellEnd"/>
-      <w:r>
-        <w:rPr>
-          <w:rFonts w:ascii="Consolas" w:hAnsi="Consolas"/>
-          <w:sz w:val="20"/>
-        </w:rPr>
-        <w:t xml:space="preserve">", </w:t>
-      </w:r>
-      <w:proofErr w:type="spellStart"/>
-      <w:r>
-        <w:rPr>
-          <w:rFonts w:ascii="Consolas" w:hAnsi="Consolas"/>
-          <w:sz w:val="20"/>
-        </w:rPr>
-        <w:t>default_value</w:t>
-      </w:r>
-      <w:proofErr w:type="spellEnd"/>
-      <w:r>
-        <w:rPr>
-          <w:rFonts w:ascii="Consolas" w:hAnsi="Consolas"/>
-          <w:sz w:val="20"/>
-        </w:rPr>
-        <w:t>="0")</w:t>
-      </w:r>
-      <w:r>
-        <w:t xml:space="preserve"> — at line 167 the default is camera port 0; change it to the port your camera is attached to.</w:t>
-      </w:r>
-    </w:p>
-    <w:p>
-      <w:r>
-        <w:t xml:space="preserve">Also make sure the port is updated in </w:t>
-      </w:r>
-      <w:r>
-        <w:rPr>
-          <w:rFonts w:ascii="Consolas" w:hAnsi="Consolas"/>
-          <w:sz w:val="20"/>
-        </w:rPr>
-        <w:t>src/project/mediapipe_pose_tracking/scripts/hand_pose_publisher_node.py</w:t>
-      </w:r>
-      <w:r>
-        <w:t>:</w:t>
-      </w:r>
-    </w:p>
-    <w:p>
-      <w:proofErr w:type="spellStart"/>
-      <w:proofErr w:type="gramStart"/>
-      <w:r>
-        <w:rPr>
-          <w:rFonts w:ascii="Consolas" w:hAnsi="Consolas"/>
-          <w:sz w:val="20"/>
-        </w:rPr>
-        <w:t>DeclareLaunchArgument</w:t>
-      </w:r>
-      <w:proofErr w:type="spellEnd"/>
-      <w:r>
-        <w:rPr>
-          <w:rFonts w:ascii="Consolas" w:hAnsi="Consolas"/>
-          <w:sz w:val="20"/>
-        </w:rPr>
-        <w:t>(</w:t>
-      </w:r>
-      <w:proofErr w:type="gramEnd"/>
-      <w:r>
-        <w:rPr>
-          <w:rFonts w:ascii="Consolas" w:hAnsi="Consolas"/>
-          <w:sz w:val="20"/>
-        </w:rPr>
-        <w:t>"</w:t>
-      </w:r>
-      <w:proofErr w:type="spellStart"/>
-      <w:r>
-        <w:rPr>
-          <w:rFonts w:ascii="Consolas" w:hAnsi="Consolas"/>
-          <w:sz w:val="20"/>
-        </w:rPr>
-        <w:t>camera_device</w:t>
-      </w:r>
-      <w:proofErr w:type="spellEnd"/>
-      <w:r>
-        <w:rPr>
-          <w:rFonts w:ascii="Consolas" w:hAnsi="Consolas"/>
-          <w:sz w:val="20"/>
-        </w:rPr>
-        <w:t xml:space="preserve">", </w:t>
-      </w:r>
-      <w:proofErr w:type="spellStart"/>
-      <w:r>
-        <w:rPr>
-          <w:rFonts w:ascii="Consolas" w:hAnsi="Consolas"/>
-          <w:sz w:val="20"/>
-        </w:rPr>
-        <w:t>default_value</w:t>
-      </w:r>
-      <w:proofErr w:type="spellEnd"/>
-      <w:r>
-        <w:rPr>
-          <w:rFonts w:ascii="Consolas" w:hAnsi="Consolas"/>
-          <w:sz w:val="20"/>
-        </w:rPr>
-        <w:t>="0")</w:t>
-      </w:r>
-      <w:r>
-        <w:t xml:space="preserve"> — see line 67; the default is port 0.</w:t>
+        <w:t>Step 6 — Run the demo</w:t>
+      </w:r>
+    </w:p>
+    <w:p>
+      <w:pPr>
+        <w:rPr>
+          <w:rFonts w:ascii="Consolas" w:hAnsi="Consolas"/>
+          <w:sz w:val="20"/>
+        </w:rPr>
+      </w:pPr>
+      <w:r>
+        <w:rPr>
+          <w:rFonts w:ascii="Consolas" w:hAnsi="Consolas"/>
+          <w:sz w:val="20"/>
+        </w:rPr>
+        <w:t xml:space="preserve">ros2 launch </w:t>
+      </w:r>
+      <w:proofErr w:type="spellStart"/>
+      <w:r>
+        <w:rPr>
+          <w:rFonts w:ascii="Consolas" w:hAnsi="Consolas"/>
+          <w:sz w:val="20"/>
+        </w:rPr>
+        <w:t>mediapipe_pose_tracking</w:t>
+      </w:r>
+      <w:proofErr w:type="spellEnd"/>
+      <w:r>
+        <w:rPr>
+          <w:rFonts w:ascii="Consolas" w:hAnsi="Consolas"/>
+          <w:sz w:val="20"/>
+        </w:rPr>
+        <w:t xml:space="preserve"> omniman_hand_teleop_demo.launch.py</w:t>
       </w:r>
     </w:p>
     <w:p>
@@ -710,58 +737,9 @@
     </w:p>
     <w:p>
       <w:pPr>
-        <w:pStyle w:val="Heading2"/>
-      </w:pPr>
-      <w:r>
-        <w:t>Step 6 — Run the demo</w:t>
-      </w:r>
-    </w:p>
-    <w:p>
-      <w:pPr>
-        <w:rPr>
-          <w:rFonts w:ascii="Consolas" w:hAnsi="Consolas"/>
-          <w:sz w:val="20"/>
-        </w:rPr>
-      </w:pPr>
-      <w:r>
-        <w:rPr>
-          <w:rFonts w:ascii="Consolas" w:hAnsi="Consolas"/>
-          <w:sz w:val="20"/>
-        </w:rPr>
-        <w:t xml:space="preserve">ros2 launch </w:t>
-      </w:r>
-      <w:proofErr w:type="spellStart"/>
-      <w:r>
-        <w:rPr>
-          <w:rFonts w:ascii="Consolas" w:hAnsi="Consolas"/>
-          <w:sz w:val="20"/>
-        </w:rPr>
-        <w:t>mediapipe_pose_tracking</w:t>
-      </w:r>
-      <w:proofErr w:type="spellEnd"/>
-      <w:r>
-        <w:rPr>
-          <w:rFonts w:ascii="Consolas" w:hAnsi="Consolas"/>
-          <w:sz w:val="20"/>
-        </w:rPr>
-        <w:t xml:space="preserve"> omniman_hand_teleop_demo.launch.py</w:t>
-      </w:r>
-    </w:p>
-    <w:p>
-      <w:pPr>
-        <w:rPr>
-          <w:rFonts w:cstheme="minorHAnsi"/>
-          <w:sz w:val="22"/>
-          <w:szCs w:val="22"/>
-        </w:rPr>
-      </w:pPr>
-    </w:p>
-    <w:p>
-      <w:pPr>
         <w:pStyle w:val="Heading1"/>
       </w:pPr>
       <w:r>
-        <w:lastRenderedPageBreak/>
         <w:t>4. How It Works</w:t>
       </w:r>
     </w:p>
@@ -856,7 +834,7 @@
       </w:r>
       <w:proofErr w:type="gramEnd"/>
       <w:r>
-        <w:t xml:space="preserve"> the arm toward it in real time. This project adds an LSTM trajectory predictor in front of that controller — instead of commanding the EMA-smoothed (lagging) hand position, the node commands the position the LSTM predicts ~100 </w:t>
+        <w:t xml:space="preserve"> the arm toward it in real time. This project adds an LSTM trajectory predictor in front of that controller — instead of commanding the EMA-smoothed hand position, the node commands the position the LSTM predicts ~100 </w:t>
       </w:r>
       <w:proofErr w:type="spellStart"/>
       <w:r>
@@ -869,50 +847,16 @@
     </w:p>
     <w:p>
       <w:r>
-        <w:t>Move your right hand to control the target position. Raise your left hand to reset the arm to the ready pose — useful when you run into a singularity. Press m at runtime to toggle between LSTM and EMA modes (the active mode is shown in the camera overlay).</w:t>
-      </w:r>
-    </w:p>
-    <w:p>
-      <w:pPr>
-        <w:rPr>
-          <w:rFonts w:cstheme="minorHAnsi"/>
-          <w:sz w:val="22"/>
-          <w:szCs w:val="22"/>
-        </w:rPr>
-      </w:pPr>
-      <w:r>
-        <w:rPr>
-          <w:rFonts w:cstheme="minorHAnsi"/>
-          <w:sz w:val="22"/>
-          <w:szCs w:val="22"/>
-        </w:rPr>
-        <w:t xml:space="preserve"> </w:t>
-      </w:r>
-    </w:p>
-    <w:p>
-      <w:pPr>
-        <w:rPr>
-          <w:rFonts w:cstheme="minorHAnsi"/>
-          <w:sz w:val="22"/>
-          <w:szCs w:val="22"/>
-        </w:rPr>
-      </w:pPr>
-    </w:p>
-    <w:p>
-      <w:pPr>
-        <w:rPr>
-          <w:rFonts w:cstheme="minorHAnsi"/>
-          <w:color w:val="000000" w:themeColor="text1"/>
-          <w:sz w:val="22"/>
-          <w:szCs w:val="22"/>
-        </w:rPr>
-      </w:pPr>
-    </w:p>
+        <w:t xml:space="preserve">Move your right hand to control the target position. Raise your left hand to reset the arm to the ready pose — useful when you run into a singularity. </w:t>
+      </w:r>
+    </w:p>
+    <w:p/>
     <w:p>
       <w:pPr>
         <w:pStyle w:val="Heading1"/>
       </w:pPr>
       <w:r>
+        <w:lastRenderedPageBreak/>
         <w:t>5. Repository Map (ML Components)</w:t>
       </w:r>
     </w:p>
@@ -926,15 +870,10 @@
       </w:r>
       <w:proofErr w:type="spellEnd"/>
       <w:r>
-        <w:t xml:space="preserve"> package (branch </w:t>
-      </w:r>
-      <w:proofErr w:type="spellStart"/>
-      <w:r>
-        <w:t>final_project</w:t>
-      </w:r>
-      <w:proofErr w:type="spellEnd"/>
-      <w:r>
-        <w:t>):</w:t>
+        <w:t xml:space="preserve"> package</w:t>
+      </w:r>
+      <w:r>
+        <w:t>:</w:t>
       </w:r>
     </w:p>
     <w:p>
@@ -942,7 +881,9 @@
         <w:pStyle w:val="ListBullet"/>
       </w:pPr>
       <w:r>
-        <w:lastRenderedPageBreak/>
+        <w:t>project/mediapipe_pose_tracking/</w:t>
+      </w:r>
+      <w:r>
         <w:t>scripts/hand_pose_publisher_node.py — teleoperation node with the recording mode (r key), the deployed LSTM predictor, and the LSTM/EMA toggle (m key)</w:t>
       </w:r>
     </w:p>
@@ -951,6 +892,9 @@
         <w:pStyle w:val="ListBullet"/>
       </w:pPr>
       <w:r>
+        <w:t>report/</w:t>
+      </w:r>
+      <w:r>
         <w:t>dataset/hand_traj_*.csv — the recorded sessions (22,420 frames)</w:t>
       </w:r>
     </w:p>
@@ -975,6 +919,9 @@
         <w:pStyle w:val="ListBullet"/>
       </w:pPr>
       <w:r>
+        <w:t>report/</w:t>
+      </w:r>
+      <w:r>
         <w:t>models/</w:t>
       </w:r>
       <w:proofErr w:type="spellStart"/>
@@ -1033,6 +980,17 @@
     </w:p>
     <w:p>
       <w:pPr>
+        <w:pStyle w:val="ListBullet"/>
+        <w:numPr>
+          <w:ilvl w:val="0"/>
+          <w:numId w:val="0"/>
+        </w:numPr>
+        <w:ind w:left="360"/>
+        <w:jc w:val="right"/>
+      </w:pPr>
+    </w:p>
+    <w:p>
+      <w:pPr>
         <w:pStyle w:val="Heading1"/>
       </w:pPr>
       <w:r>
@@ -1042,6 +1000,19 @@
     <w:p>
       <w:pPr>
         <w:pStyle w:val="ListNumber"/>
+        <w:numPr>
+          <w:ilvl w:val="0"/>
+          <w:numId w:val="0"/>
+        </w:numPr>
+        <w:ind w:left="360" w:hanging="360"/>
+      </w:pPr>
+      <w:r>
+        <w:t>We use the same file for running the demo and for collecting dataset.</w:t>
+      </w:r>
+    </w:p>
+    <w:p>
+      <w:pPr>
+        <w:pStyle w:val="ListNumber"/>
       </w:pPr>
       <w:r>
         <w:t>Run the teleoperation node (the robot is optional — only the webcam is needed), press r, and move your hand to record a new CSV session.</w:t>
@@ -1084,6 +1055,7 @@
         <w:t>), hidden size 32, single LSTM layer, Adam (learning rate 10⁻³), batch size 256, 60 epochs, best-validation checkpoint, seed 42.</w:t>
       </w:r>
     </w:p>
+    <w:p/>
     <w:p>
       <w:pPr>
         <w:pStyle w:val="Heading1"/>
@@ -1250,6 +1222,7 @@
     </w:tbl>
     <w:p>
       <w:r>
+        <w:lastRenderedPageBreak/>
         <w:t xml:space="preserve">Under 5-fold blocked cross-validation the LSTM scores 2.28 ± 0.45 mm MAE and 4.75 ± 1.67 mm RMSE, beating both baselines in all five folds on both metrics. Inference takes 0.1–0.2 </w:t>
       </w:r>
       <w:proofErr w:type="spellStart"/>
@@ -2842,7 +2815,7 @@
 
 <file path=word/webextensions/taskpanes.xml><?xml version="1.0" encoding="utf-8"?>
 <wetp:taskpanes xmlns:wetp="http://schemas.microsoft.com/office/webextensions/taskpanes/2010/11">
-  <wetp:taskpane dockstate="right" visibility="0" width="722" row="1">
+  <wetp:taskpane dockstate="right" visibility="0" width="525" row="1">
     <wetp:webextensionref xmlns:r="http://schemas.openxmlformats.org/officeDocument/2006/relationships" r:id="rId1"/>
   </wetp:taskpane>
 </wetp:taskpanes>

</xml_diff>